<commit_message>
Correct Kawasaki migration report after source verification
Fix ControlNet on D, F02 model list (ZX/MT), neoROSET comparison scope,
SAVE data types, add LOAD/Q, D-SUB 37 I/O, Software PLC and document numbers.

Co-authored-by: Maciej <WeaverTech@users.noreply.github.com>
</commit_message>
<xml_diff>
--- a/artifacts/kawasaki-migration-report/Raport_migracja_Kawasaki_D_do_E_F.docx
+++ b/artifacts/kawasaki-migration-report/Raport_migracja_Kawasaki_D_do_E_F.docx
@@ -113,7 +113,7 @@
         <w:pStyle w:val="ListBullet"/>
       </w:pPr>
       <w:r>
-        <w:t>Ten sam model ramienia rzeczywiście występuje w kilku generacjach: MX350L/MX420L/MX500N/MX700N (D, E, F04) oraz ZX300S (D, E, F02). Dla innych rodzin (np. seria FS) następcą jest inny model (seria RS).</w:t>
+        <w:t>Ten sam model ramienia rzeczywiście występuje w kilku generacjach: MX350L/MX420L/MX500N/MX700N (D, E, F04), ZX130L/ZX165U/ZX200S/ZX300S i MT400N (D, E, F02). Dla innych rodzin (np. seria FS) następcą jest inny model (seria RS).</w:t>
       </w:r>
     </w:p>
     <w:p>
@@ -327,7 +327,7 @@
               <w:rPr>
                 <w:sz w:val="18"/>
               </w:rPr>
-              <w:t>ZX300S</w:t>
+              <w:t>ZX130L, ZX165U, ZX200S, ZX300S</w:t>
             </w:r>
           </w:p>
         </w:tc>
@@ -385,65 +385,7 @@
               <w:rPr>
                 <w:sz w:val="18"/>
               </w:rPr>
-              <w:t>ZX130S/L, ZX165U, ZX200S</w:t>
-            </w:r>
-          </w:p>
-        </w:tc>
-        <w:tc>
-          <w:tcPr>
-            <w:tcW w:type="dxa" w:w="1652"/>
-          </w:tcPr>
-          <w:p>
-            <w:r/>
-            <w:r>
-              <w:rPr>
-                <w:sz w:val="18"/>
-              </w:rPr>
-              <w:t>tak</w:t>
-            </w:r>
-          </w:p>
-        </w:tc>
-        <w:tc>
-          <w:tcPr>
-            <w:tcW w:type="dxa" w:w="1652"/>
-          </w:tcPr>
-          <w:p>
-            <w:r/>
-            <w:r>
-              <w:rPr>
-                <w:sz w:val="18"/>
-              </w:rPr>
-              <w:t>tak (E02)</w:t>
-            </w:r>
-          </w:p>
-        </w:tc>
-        <w:tc>
-          <w:tcPr>
-            <w:tcW w:type="dxa" w:w="3993"/>
-          </w:tcPr>
-          <w:p>
-            <w:r/>
-            <w:r>
-              <w:rPr>
-                <w:sz w:val="18"/>
-              </w:rPr>
-              <w:t>nie ma na liście F02; seria Z ogólnie w instrukcji F0x - do potwierdzenia</w:t>
-            </w:r>
-          </w:p>
-        </w:tc>
-      </w:tr>
-      <w:tr>
-        <w:tc>
-          <w:tcPr>
-            <w:tcW w:type="dxa" w:w="2341"/>
-          </w:tcPr>
-          <w:p>
-            <w:r/>
-            <w:r>
-              <w:rPr>
-                <w:sz w:val="18"/>
-              </w:rPr>
-              <w:t>MT (np. MT400N)</w:t>
+              <w:t>ZX130S</w:t>
             </w:r>
           </w:p>
         </w:tc>
@@ -485,7 +427,65 @@
               <w:rPr>
                 <w:sz w:val="18"/>
               </w:rPr>
-              <w:t>seria MT w specyfikacji F02 - do potwierdzenia dla konkretnego modelu</w:t>
+              <w:t>tylko na brytyjskiej wersji strony F02 - do potwierdzenia</w:t>
+            </w:r>
+          </w:p>
+        </w:tc>
+      </w:tr>
+      <w:tr>
+        <w:tc>
+          <w:tcPr>
+            <w:tcW w:type="dxa" w:w="2341"/>
+          </w:tcPr>
+          <w:p>
+            <w:r/>
+            <w:r>
+              <w:rPr>
+                <w:sz w:val="18"/>
+              </w:rPr>
+              <w:t>MT400N</w:t>
+            </w:r>
+          </w:p>
+        </w:tc>
+        <w:tc>
+          <w:tcPr>
+            <w:tcW w:type="dxa" w:w="1652"/>
+          </w:tcPr>
+          <w:p>
+            <w:r/>
+            <w:r>
+              <w:rPr>
+                <w:sz w:val="18"/>
+              </w:rPr>
+              <w:t>tak</w:t>
+            </w:r>
+          </w:p>
+        </w:tc>
+        <w:tc>
+          <w:tcPr>
+            <w:tcW w:type="dxa" w:w="1652"/>
+          </w:tcPr>
+          <w:p>
+            <w:r/>
+            <w:r>
+              <w:rPr>
+                <w:sz w:val="18"/>
+              </w:rPr>
+              <w:t>tak</w:t>
+            </w:r>
+          </w:p>
+        </w:tc>
+        <w:tc>
+          <w:tcPr>
+            <w:tcW w:type="dxa" w:w="3993"/>
+          </w:tcPr>
+          <w:p>
+            <w:r/>
+            <w:r>
+              <w:rPr>
+                <w:sz w:val="18"/>
+              </w:rPr>
+              <w:t>tak, F02</w:t>
             </w:r>
           </w:p>
         </w:tc>
@@ -556,7 +556,7 @@
           <w:i/>
           <w:sz w:val="18"/>
         </w:rPr>
-        <w:t>Źródła: lista wycofanych modeli Kawasaki (08.2023), strony produktów F02, F04 i E02, specyfikacja F0x. Gdy „ten sam model” jest następcą, przed zamówieniem trzeba porównać karty katalogowe: zakresy osi, zasięg, wymiary podstawy i kołnierza.</w:t>
+        <w:t>Źródła: lista wycofanych modeli Kawasaki (08.2023), strony produktów F02, F04 i E02 (stan 13.10.2026), specyfikacja F0x. Regionalne wersje strony F02 różnią się listą ramion, dlatego dokładny kod modelu trzeba potwierdzić u dystrybutora. Gdy „ten sam model” jest następcą, przed zamówieniem trzeba porównać karty katalogowe: zakresy osi, zasięg, wymiary podstawy i kołnierza.</w:t>
       </w:r>
     </w:p>
     <w:p>
@@ -923,7 +923,7 @@
               <w:rPr>
                 <w:sz w:val="18"/>
               </w:rPr>
-              <w:t>Język AS jest zgodny wstecz. KRterm pokaże przy wczytywaniu linie, których nowy kontroler nie przyjmie.</w:t>
+              <w:t>Te same polecenia SAVE/LOAD w D i F. LOAD przerywa się, jeśli program o tej nazwie już jest w pamięci - wczytywać do czystego kontrolera.</w:t>
             </w:r>
           </w:p>
         </w:tc>
@@ -1039,7 +1039,7 @@
               <w:rPr>
                 <w:sz w:val="18"/>
               </w:rPr>
-              <w:t>Liczniki, parametry, przesunięcia.</w:t>
+              <w:t>Liczniki, parametry, przesunięcia. Zmienne o tej samej nazwie LOAD nadpisuje bez ostrzeżenia.</w:t>
             </w:r>
           </w:p>
         </w:tc>
@@ -1097,7 +1097,7 @@
               <w:rPr>
                 <w:sz w:val="18"/>
               </w:rPr>
-              <w:t>Uwaga na teksty ze znakami sterującymi z PLC - potrafią uszkodzić zapis.</w:t>
+              <w:t>Jak wyżej: nadpisywane bez ostrzeżenia.</w:t>
             </w:r>
           </w:p>
         </w:tc>
@@ -1329,7 +1329,7 @@
               <w:rPr>
                 <w:sz w:val="18"/>
               </w:rPr>
-              <w:t>E ma opcję KLogic; dla F potwierdzić dostępność opcji i zgodność programu.</w:t>
+              <w:t>D miał K-Logic, F0x ma opcję Software PLC; zgodność programu trzeba potwierdzić.</w:t>
             </w:r>
           </w:p>
         </w:tc>
@@ -1387,7 +1387,7 @@
               <w:rPr>
                 <w:sz w:val="18"/>
               </w:rPr>
-              <w:t>Model, numer seryjny, zerowanie i parametry serwo nowego ramienia są ustawione fabrycznie.</w:t>
+              <w:t>Model, numer seryjny, zerowanie i inne dane nowego ramienia są ustawione fabrycznie.</w:t>
             </w:r>
           </w:p>
         </w:tc>
@@ -1445,7 +1445,7 @@
               <w:rPr>
                 <w:sz w:val="18"/>
               </w:rPr>
-              <w:t>Zawiera dane robota. Można go użyć jako archiwum i źródło do wycięcia sekcji z panelem, programami i zmiennymi.</w:t>
+              <w:t>W praktyce plik pełnego backupu zawiera też dane robota. Można go użyć jako archiwum i źródło do wycięcia sekcji z panelem, programami i zmiennymi.</w:t>
             </w:r>
           </w:p>
         </w:tc>
@@ -1458,7 +1458,7 @@
           <w:i/>
           <w:sz w:val="18"/>
         </w:rPr>
-        <w:t>Praktyczna metoda przy przejściu z D na E opisana przez praktyków: zrobić kopię pliku pełnego backupu, usunąć z niej wszystko powyżej sekcji danych panelu (MFP) i wczytać resztę. Przenosi to panel, programy, zmienne i teksty bez ryzyka nadpisania danych robota.</w:t>
+        <w:t>Wczytywanie selektywne: LOAD/Q pyta osobno o każdą porcję danych systemowych i każdy program (Tak / Nie / Wczytaj wszystko / Wyjdź). Metoda praktyków przy przejściu z D na E: zrobić kopię pliku pełnego backupu, usunąć z niej wszystko powyżej sekcji danych panelu (MFP) i wczytać resztę. Przenosi to panel, programy, zmienne i teksty bez ryzyka nadpisania danych robota.</w:t>
       </w:r>
     </w:p>
     <w:p>
@@ -1578,7 +1578,7 @@
               <w:rPr>
                 <w:sz w:val="18"/>
               </w:rPr>
-              <w:t>32 we / 32 wy standardowo (karta 1HW/1GW, złącza 37-pin D-sub), opcjonalnie 64/96/128</w:t>
+              <w:t>32 we / 32 wy na karcie 1HW/1GW (złącza CN2/CN4, 37-pin D-sub), więcej z dodatkowymi kartami</w:t>
             </w:r>
           </w:p>
         </w:tc>
@@ -1592,7 +1592,7 @@
               <w:rPr>
                 <w:sz w:val="18"/>
               </w:rPr>
-              <w:t>32 we / 32 wy standardowo, do 64/64 w szafie i 128/128 z remote I/O</w:t>
+              <w:t>32 we / 32 wy standardowo, do 64/64 w szafie i 128/128 z remote I/O; opcjonalne złącze też 37-pin D-sub</w:t>
             </w:r>
           </w:p>
         </w:tc>
@@ -1606,7 +1606,7 @@
               <w:rPr>
                 <w:sz w:val="18"/>
               </w:rPr>
-              <w:t>Spisać mapę sygnałów, przygotować nowe przewody lub listwy przyłączeniowe do nowych złączy.</w:t>
+              <w:t>Spisać mapę sygnałów. Typ złącza może być ten sam, ale przypisanie pinów trzeba porównać z instrukcją External I/O dla F.</w:t>
             </w:r>
           </w:p>
         </w:tc>
@@ -1694,7 +1694,7 @@
               <w:rPr>
                 <w:sz w:val="18"/>
               </w:rPr>
-              <w:t>DeviceNet, PROFIBUS-DP, INTERBUS, CC-Link, EtherNet/IP, ControlNet (opcje)</w:t>
+              <w:t>DeviceNet, PROFIBUS, INTERBUS, EtherNet/IP, Modbus-TCP, CC-Link (opcje)</w:t>
             </w:r>
           </w:p>
         </w:tc>
@@ -1905,7 +1905,7 @@
     <w:p/>
     <w:p>
       <w:r>
-        <w:t>PROFINET i CANopen były dostępne w kontrolerze E, ale nie w D. Jeśli stanowisko używa sieci, której nie ma w ofercie dla F (np. INTERBUS, ControlNet), trzeba zmienić sieć lub dodać bramkę.</w:t>
+        <w:t>PROFINET, CANopen, ControlNet, EtherCAT i CC-Link IE były dostępne tylko w kontrolerze E, nie w D. Katalog Kawasaki dla kontrolera F60 wymienia CC-Link, CC-Link IE, DeviceNet, EtherNet/IP, EtherCAT, PROFIBUS-DP i PROFINET, bez INTERBUS. Jeśli stanowisko z D pracuje na INTERBUS (albo na Allen-Bradley Remote I/O), trzeba potwierdzić dostępność dla F0x albo zaplanować zmianę sieci lub bramkę.</w:t>
       </w:r>
     </w:p>
     <w:p>
@@ -1955,7 +1955,15 @@
         <w:pStyle w:val="ListBullet"/>
       </w:pPr>
       <w:r>
-        <w:t>neoROSET wczytuje pełny backup z prawdziwego kontrolera D, D+, E i F, pozwala podmienić model robota bez zmiany układu stanowiska, przesuwać i lustrzanie kopiować punkty oraz porównywać tekst programów. Pozwala to sprawdzić zasięg i kolizje przed demontażem.</w:t>
+        <w:t>neoROSET wczytuje pełny backup z prawdziwego kontrolera D, D+, E i F, pozwala podmienić model robota bez zmiany układu stanowiska, przesuwać i lustrzanie kopiować punkty oraz porównywać dane kontrolera z danymi w projekcie. Pozwala to sprawdzić zasięg i kolizje przed demontażem.</w:t>
+      </w:r>
+    </w:p>
+    <w:p>
+      <w:pPr>
+        <w:pStyle w:val="ListBullet"/>
+      </w:pPr>
+      <w:r>
+        <w:t>Jeśli docelowe ramię nie jest identyczne (następca), punkty zapisane jako kąty osi (joint) trzeba douczyć. Praktycy zalecają przeliczyć je przed backupem na transformacje.</w:t>
       </w:r>
     </w:p>
     <w:p>
@@ -2350,7 +2358,7 @@
     </w:p>
     <w:p>
       <w:r>
-        <w:t>Wskazówka praktyków: kontrolery E i F mają szybszy procesor, więc ciasne pętle w programach PC i w programie głównym warto spowolnić krótkim TWAIT (np. TWAIT 0.02), żeby kontroler pozostawał responsywny.</w:t>
+        <w:t>Wskazówka praktyków przy przejściu na E (F ma jeszcze szybszy procesor): ciasne pętle w programach PC i w programie głównym warto spowolnić krótkim TWAIT (np. TWAIT 0.02), żeby kontroler pozostawał responsywny.</w:t>
       </w:r>
     </w:p>
     <w:p>
@@ -2728,7 +2736,7 @@
         <w:pStyle w:val="ListBullet"/>
       </w:pPr>
       <w:r>
-        <w:t>Doprecyzowanie: „ten sam model ramienia” z nowszym kontrolerem istnieje dla części rodzin (MX, ZX300S). Dla innych jest to następca, którego kartę katalogową trzeba porównać.</w:t>
+        <w:t>Doprecyzowanie: „ten sam model ramienia” z nowszym kontrolerem istnieje dla części rodzin (MX, ZX130L, ZX165U, ZX200S, ZX300S, MT400N). Dla innych jest to następca, którego kartę katalogową trzeba porównać.</w:t>
       </w:r>
     </w:p>
     <w:p>
@@ -2736,7 +2744,7 @@
         <w:pStyle w:val="ListBullet"/>
       </w:pPr>
       <w:r>
-        <w:t>Potwierdzone w dokumentacji: polecenia SAVE/P, /L, /R, /S, /A, /SYS i /ROB w kontrolerach D i F; zachowanie płytki Arm ID (wybór strony ramienia lub kontrolera); E0x jako poprzednik F0x; wersje A/B kontrolerów F0x; wczytywanie backupów D, D+, E i F w neoROSET.</w:t>
+        <w:t>Korekta: ControlNet nie był dostępny dla kontrolera D, tylko dla E (lista kodów produktów w instrukcji fieldbusa 90210-1184, tabela X3).</w:t>
       </w:r>
     </w:p>
     <w:p>
@@ -2744,7 +2752,39 @@
         <w:pStyle w:val="ListBullet"/>
       </w:pPr>
       <w:r>
-        <w:t>Oparte na doświadczeniu praktyków (forum robot-forum.com), nie na dokumentacji Kawasaki: metoda wycinania sekcji z backupu, nieprzenoszenie wartości BITS na panelu, wskazówka z TWAIT, ocena zgodności danych pomocniczych i systemowych.</w:t>
+        <w:t>Korekta: aktualna strona F02 wymienia ZX130L, ZX165U, ZX200S i MT400N, więc te ramiona też są dostępne z F.</w:t>
+      </w:r>
+    </w:p>
+    <w:p>
+      <w:pPr>
+        <w:pStyle w:val="ListBullet"/>
+      </w:pPr>
+      <w:r>
+        <w:t>Doprecyzowanie: instrukcja AS opisuje samo SAVE jako zapis pięciu typów danych (programy, punkty, liczby, teksty, dane systemowe). To, że plik pełnego backupu zawiera też dane robota, wynika z praktyki i z okna wczytywania w neoROSET, a nie z opisu polecenia.</w:t>
+      </w:r>
+    </w:p>
+    <w:p>
+      <w:pPr>
+        <w:pStyle w:val="ListBullet"/>
+      </w:pPr>
+      <w:r>
+        <w:t>Potwierdzone w dokumentacji: polecenia SAVE/P, /L, /R, /S, /A, /SYS i /ROB oraz LOAD/Q w kontrolerach D i F; zachowanie płytki Arm ID (wybór strony ramienia lub kontrolera); E0x jako poprzednik F0x; wersje A/B kontrolerów F0x; wczytywanie backupów D, D+, E i F w neoROSET.</w:t>
+      </w:r>
+    </w:p>
+    <w:p>
+      <w:pPr>
+        <w:pStyle w:val="ListBullet"/>
+      </w:pPr>
+      <w:r>
+        <w:t>Oparte na doświadczeniu praktyków (forum robot-forum.com), nie na dokumentacji Kawasaki: metoda wycinania sekcji z backupu, nieprzenoszenie wartości BITS na panelu, wskazówka z TWAIT, przeliczanie punktów joint na transformacje, ocena zgodności danych pomocniczych i systemowych.</w:t>
+      </w:r>
+    </w:p>
+    <w:p>
+      <w:pPr>
+        <w:pStyle w:val="ListBullet"/>
+      </w:pPr>
+      <w:r>
+        <w:t>Każde twierdzenie z raportu ma przypisane źródło (dokument, rozdział, strona) w osobnym pliku Zrodla_i_odwolania.md.</w:t>
       </w:r>
     </w:p>
     <w:p>
@@ -2781,7 +2821,15 @@
         <w:pStyle w:val="ListBullet"/>
       </w:pPr>
       <w:r>
-        <w:t>Dostępność potrzebnej sieci fieldbus i opcji (np. K-Logic) dla kontrolera F.</w:t>
+        <w:t>Dostępność potrzebnej sieci fieldbus i opcji (np. Software PLC zamiast K-Logic) dla kontrolera F0x - lista sieci dla F0x jest w instrukcji 90210-1326, której nie ma publicznie.</w:t>
+      </w:r>
+    </w:p>
+    <w:p>
+      <w:pPr>
+        <w:pStyle w:val="ListBullet"/>
+      </w:pPr>
+      <w:r>
+        <w:t>Przypisanie pinów złącza I/O w F0x względem karty 1HW/1GW z kontrolera D.</w:t>
       </w:r>
     </w:p>
     <w:p>
@@ -2839,7 +2887,7 @@
         <w:pStyle w:val="ListBullet"/>
       </w:pPr>
       <w:r>
-        <w:t>Specyfikacja kontrolerów F0x: kawasakirobotics.com/uploads/sites/2/2022/01/F0x-E-1-1.pdf</w:t>
+        <w:t>Specyfikacja kontrolerów F0x (90152-0091DEE): kawasakirobotics.com/uploads/sites/2/2022/01/F0x-E-1-1.pdf</w:t>
       </w:r>
     </w:p>
     <w:p>
@@ -2847,7 +2895,7 @@
         <w:pStyle w:val="ListBullet"/>
       </w:pPr>
       <w:r>
-        <w:t>Instrukcja instalacji F0x: kawasakirobotics.com/uploads/sites/2/2022/01/F0x_Series_Controller-Installation_and_Connection_Manual-E-4.pdf</w:t>
+        <w:t>Instrukcja instalacji F0x (90202-1252DEH): kawasakirobotics.com/uploads/sites/2/2022/01/F0x_Series_Controller-Installation_and_Connection_Manual-E-4.pdf</w:t>
       </w:r>
     </w:p>
     <w:p>
@@ -2855,7 +2903,7 @@
         <w:pStyle w:val="ListBullet"/>
       </w:pPr>
       <w:r>
-        <w:t>Strony kontrolerów F02, F04 i E02: kawasakirobotics.com (sekcja Controllers)</w:t>
+        <w:t>Strony kontrolerów F02, F04, E02 i E04: kawasakirobotics.com/products-controllers/</w:t>
       </w:r>
     </w:p>
     <w:p>
@@ -2863,7 +2911,7 @@
         <w:pStyle w:val="ListBullet"/>
       </w:pPr>
       <w:r>
-        <w:t>AS Language Reference Manual, kontroler F (90209-1025) i kontroler D - polecenia SAVE/LOAD</w:t>
+        <w:t>AS Language Reference Manual, kontroler F (90209-1025DEB) i kontroler D (90209-1017) - rozdział 5.3, SAVE/LOAD</w:t>
       </w:r>
     </w:p>
     <w:p>
@@ -2871,7 +2919,7 @@
         <w:pStyle w:val="ListBullet"/>
       </w:pPr>
       <w:r>
-        <w:t>General Fieldbus I/O Usage Manual, kontrolery D/E (90210-1184)</w:t>
+        <w:t>General Fieldbus I/O Usage Manual, kontrolery D/E (90210-1184DEK)</w:t>
       </w:r>
     </w:p>
     <w:p>
@@ -2879,7 +2927,7 @@
         <w:pStyle w:val="ListBullet"/>
       </w:pPr>
       <w:r>
-        <w:t>Arm ID Board Instruction Manual, kontroler D (90210-1174) i E (90210-1246)</w:t>
+        <w:t>Arm ID Board Instruction Manual, kontroler D (90210-1174DEA)</w:t>
       </w:r>
     </w:p>
     <w:p>
@@ -2887,7 +2935,7 @@
         <w:pStyle w:val="ListBullet"/>
       </w:pPr>
       <w:r>
-        <w:t>Specyfikacja kontrolerów D70/D4x (broszura Kawasaki)</w:t>
+        <w:t>Installation and Connection Manual, kontroler D (D30-D34) oraz broszura kontrolera D (Kawasaki Robotics USA)</w:t>
       </w:r>
     </w:p>
     <w:p>
@@ -2895,7 +2943,15 @@
         <w:pStyle w:val="ListBullet"/>
       </w:pPr>
       <w:r>
-        <w:t>neoROSET Operation Manual oraz broszura neoROSET: kawasakirobotics.com/uploads/sites/2/2026/02/neoROSET_EN_no.2645.pdf</w:t>
+        <w:t>Katalog Kawasaki Robot (Cat. No. 3L2521, 09.2025) - opcje kontrolera F60</w:t>
+      </w:r>
+    </w:p>
+    <w:p>
+      <w:pPr>
+        <w:pStyle w:val="ListBullet"/>
+      </w:pPr>
+      <w:r>
+        <w:t>neoROSET Operation Manual (90210-1515DED) oraz broszura neoROSET: kawasakirobotics.com/uploads/sites/2/2026/02/neoROSET_EN_no.2645.pdf</w:t>
       </w:r>
     </w:p>
     <w:p>
@@ -2916,7 +2972,7 @@
     </w:p>
     <w:p>
       <w:r>
-        <w:t>Źródła praktyków (robot-forum.com, wątki 38312, 49046, 43051, 41303, 36020) - wykorzystane tylko jako uzupełnienie i oznaczone w rozdziale 11.</w:t>
+        <w:t>Źródła praktyków (robot-forum.com, wątki 38312, 49046, 43051, 41303, 36020) - wykorzystane tylko jako uzupełnienie i oznaczone w rozdziale 11. Dokładne miejsca w dokumentach (rozdział, strona, cytat) są w pliku Zrodla_i_odwolania.md.</w:t>
       </w:r>
     </w:p>
     <w:sectPr>

</xml_diff>